<commit_message>
fix(policy): align outputs with three escalation classes
</commit_message>
<xml_diff>
--- a/Policy_Hoan_Ung_CLB.docx
+++ b/Policy_Hoan_Ung_CLB.docx
@@ -236,7 +236,9 @@
             <w:pPr>
               <w:spacing w:after="0" w:before="0"/>
             </w:pPr>
-            <w:r/>
+            <w:r>
+              <w:t>1.1.0</w:t>
+            </w:r>
             <w:r>
               <w:rPr>
                 <w:rFonts w:ascii="Arial" w:hAnsi="Arial" w:eastAsia="Arial"/>
@@ -244,7 +246,6 @@
                 <w:color w:val="111111"/>
                 <w:sz w:val="18"/>
               </w:rPr>
-              <w:t>1.0.0</w:t>
             </w:r>
           </w:p>
         </w:tc>
@@ -461,7 +462,7 @@
           <w:color w:val="111111"/>
           <w:sz w:val="19"/>
         </w:rPr>
-        <w:t>Tài liệu này là mẫu quy định nội bộ, không phải ý kiến pháp lý. Câu lạc bộ sinh viên thường không phải đơn vị kế toán độc lập; quy chế của trường, Đoàn, Hội hoặc đơn vị chủ quản có quyền ưu tiên. Agent không trực tiếp chuyển tiền và không thể hợp thức hóa khoản chi trái pháp luật.</w:t>
+        <w:t>Tài liệu này là mẫu quy định nội bộ, không phải ý kiến pháp lý. Câu lạc bộ sinh viên thường không phải đơn vị kế toán độc lập; quy chế của trường, Đoàn, Hội hoặc đơn vị chủ quản có quyền ưu tiên. Agent không phê duyệt, từ chối hoặc trực tiếp chuyển tiền và không thể hợp thức hóa khoản chi trái pháp luật.</w:t>
       </w:r>
     </w:p>
     <w:p>
@@ -512,7 +513,7 @@
           <w:color w:val="111111"/>
           <w:sz w:val="20"/>
         </w:rPr>
-        <w:t>Policy chuẩn hóa cách tiếp nhận, kiểm tra, quyết định, chuyển tiếp và ghi nhật ký đối với hai nghiệp vụ tài chính của câu lạc bộ.</w:t>
+        <w:t>Policy chuẩn hóa cách tiếp nhận, kiểm tra, tính toán, phân loại kết quả xử lý, chuyển tiếp và ghi nhật ký đối với hai nghiệp vụ tài chính của câu lạc bộ.</w:t>
       </w:r>
     </w:p>
     <w:p>
@@ -836,7 +837,9 @@
             <w:pPr>
               <w:spacing w:after="0" w:before="0"/>
             </w:pPr>
-            <w:r/>
+            <w:r>
+              <w:t>Bất kỳ dữ liệu mờ, mâu thuẫn, thiếu hoặc nghi trùng đều dẫn đến ESCALATED / FACT_UNKNOWN.</w:t>
+            </w:r>
             <w:r>
               <w:rPr>
                 <w:rFonts w:ascii="Arial" w:hAnsi="Arial" w:eastAsia="Arial"/>
@@ -844,7 +847,6 @@
                 <w:color w:val="111111"/>
                 <w:sz w:val="17"/>
               </w:rPr>
-              <w:t>Bất kỳ dữ liệu mờ, mâu thuẫn, thiếu hoặc nghi trùng đều dẫn đến NEEDS_FACT.</w:t>
             </w:r>
           </w:p>
         </w:tc>
@@ -869,7 +871,9 @@
             <w:pPr>
               <w:spacing w:after="0" w:before="0"/>
             </w:pPr>
-            <w:r/>
+            <w:r>
+              <w:t>Tách xử lý và phê duyệt</w:t>
+            </w:r>
             <w:r>
               <w:rPr>
                 <w:rFonts w:ascii="Arial" w:hAnsi="Arial" w:eastAsia="Arial"/>
@@ -877,7 +881,6 @@
                 <w:color w:val="111111"/>
                 <w:sz w:val="17"/>
               </w:rPr>
-              <w:t>Tách quyết định và giải ngân</w:t>
             </w:r>
           </w:p>
         </w:tc>
@@ -897,7 +900,9 @@
             <w:pPr>
               <w:spacing w:after="0" w:before="0"/>
             </w:pPr>
-            <w:r/>
+            <w:r>
+              <w:t>ROUTINE_PROCESSED chỉ nghĩa là agent đã kiểm tra, tính toán và lập gói; approval_status luôn là PENDING_HUMAN_APPROVAL.</w:t>
+            </w:r>
             <w:r>
               <w:rPr>
                 <w:rFonts w:ascii="Arial" w:hAnsi="Arial" w:eastAsia="Arial"/>
@@ -905,7 +910,6 @@
                 <w:color w:val="111111"/>
                 <w:sz w:val="17"/>
               </w:rPr>
-              <w:t>AUTO_PROCESS chỉ nghĩa là đủ điều kiện lập gói; thủ quỹ/hệ thống được ủy quyền mới trả tiền.</w:t>
             </w:r>
           </w:p>
         </w:tc>
@@ -1017,7 +1021,9 @@
             <w:pPr>
               <w:spacing w:after="0" w:before="0"/>
             </w:pPr>
-            <w:r/>
+            <w:r>
+              <w:t>Mọi đầu vào, quy tắc, bằng chứng, kết quả xử lý, chuyển tiếp, pause, override và undo phải có audit event.</w:t>
+            </w:r>
             <w:r>
               <w:rPr>
                 <w:rFonts w:ascii="Arial" w:hAnsi="Arial" w:eastAsia="Arial"/>
@@ -1025,7 +1031,6 @@
                 <w:color w:val="111111"/>
                 <w:sz w:val="17"/>
               </w:rPr>
-              <w:t>Mọi đầu vào, quy tắc, bằng chứng, quyết định, pause, override và undo phải có audit event.</w:t>
             </w:r>
           </w:p>
         </w:tc>
@@ -2406,7 +2411,9 @@
             <w:pPr>
               <w:spacing w:after="0" w:before="0"/>
             </w:pPr>
-            <w:r/>
+            <w:r>
+              <w:t>Đọc, chuẩn hóa, đối chiếu, tính toán, phân loại đầu ra, tạo chuyển tiếp và audit.</w:t>
+            </w:r>
             <w:r>
               <w:rPr>
                 <w:rFonts w:ascii="Arial" w:hAnsi="Arial" w:eastAsia="Arial"/>
@@ -2414,7 +2421,6 @@
                 <w:color w:val="111111"/>
                 <w:sz w:val="16"/>
               </w:rPr>
-              <w:t>Đọc, chuẩn hóa, đối chiếu, tính toán, tạo quyết định/chuyển tiếp và audit.</w:t>
             </w:r>
           </w:p>
         </w:tc>
@@ -2434,7 +2440,9 @@
             <w:pPr>
               <w:spacing w:after="0" w:before="0"/>
             </w:pPr>
-            <w:r/>
+            <w:r>
+              <w:t>Phê duyệt; từ chối; chuyển tiền; tự tạo dữ kiện; bỏ qua cờ nghi vấn; ghi đè pháp luật.</w:t>
+            </w:r>
             <w:r>
               <w:rPr>
                 <w:rFonts w:ascii="Arial" w:hAnsi="Arial" w:eastAsia="Arial"/>
@@ -2442,7 +2450,6 @@
                 <w:color w:val="111111"/>
                 <w:sz w:val="16"/>
               </w:rPr>
-              <w:t>Chuyển tiền; tự tạo dữ kiện; bỏ qua cờ nghi vấn; ghi đè pháp luật.</w:t>
             </w:r>
           </w:p>
         </w:tc>
@@ -2784,7 +2791,9 @@
             <w:pPr>
               <w:spacing w:after="0" w:before="0"/>
             </w:pPr>
-            <w:r/>
+            <w:r>
+              <w:t>Sửa kết quả tài chính hoặc phê duyệt hồ sơ khi không có thẩm quyền.</w:t>
+            </w:r>
             <w:r>
               <w:rPr>
                 <w:rFonts w:ascii="Arial" w:hAnsi="Arial" w:eastAsia="Arial"/>
@@ -2792,7 +2801,6 @@
                 <w:color w:val="111111"/>
                 <w:sz w:val="16"/>
               </w:rPr>
-              <w:t>Sửa nội dung quyết định tài chính không có thẩm quyền.</w:t>
             </w:r>
           </w:p>
         </w:tc>
@@ -2816,7 +2824,7 @@
           <w:color w:val="111111"/>
           <w:sz w:val="25"/>
         </w:rPr>
-        <w:t>3.1 Ma trận quyết định mặc định</w:t>
+        <w:t>3.1 Ma trận xử lý và thẩm quyền mặc định</w:t>
       </w:r>
     </w:p>
     <w:tbl>
@@ -3002,7 +3010,9 @@
             <w:pPr>
               <w:spacing w:after="0" w:before="0"/>
             </w:pPr>
-            <w:r/>
+            <w:r>
+              <w:t>ROUTINE_PROCESSED; lập gói để con người phê duyệt.</w:t>
+            </w:r>
             <w:r>
               <w:rPr>
                 <w:rFonts w:ascii="Arial" w:hAnsi="Arial" w:eastAsia="Arial"/>
@@ -3010,7 +3020,6 @@
                 <w:color w:val="111111"/>
                 <w:sz w:val="17"/>
               </w:rPr>
-              <w:t>AUTO_PROCESS; lập gói đủ điều kiện.</w:t>
             </w:r>
           </w:p>
         </w:tc>
@@ -3091,7 +3100,9 @@
             <w:pPr>
               <w:spacing w:after="0" w:before="0"/>
             </w:pPr>
-            <w:r/>
+            <w:r>
+              <w:t>ESCALATED / AUTHORITY_REQUIRED.</w:t>
+            </w:r>
             <w:r>
               <w:rPr>
                 <w:rFonts w:ascii="Arial" w:hAnsi="Arial" w:eastAsia="Arial"/>
@@ -3099,7 +3110,6 @@
                 <w:color w:val="111111"/>
                 <w:sz w:val="17"/>
               </w:rPr>
-              <w:t>AUTHORITY_REQUIRED.</w:t>
             </w:r>
           </w:p>
         </w:tc>
@@ -3177,7 +3187,9 @@
             <w:pPr>
               <w:spacing w:after="0" w:before="0"/>
             </w:pPr>
-            <w:r/>
+            <w:r>
+              <w:t>ESCALATED / AUTHORITY_REQUIRED.</w:t>
+            </w:r>
             <w:r>
               <w:rPr>
                 <w:rFonts w:ascii="Arial" w:hAnsi="Arial" w:eastAsia="Arial"/>
@@ -3185,7 +3197,6 @@
                 <w:color w:val="111111"/>
                 <w:sz w:val="17"/>
               </w:rPr>
-              <w:t>AUTHORITY_REQUIRED.</w:t>
             </w:r>
           </w:p>
         </w:tc>
@@ -3266,7 +3277,9 @@
             <w:pPr>
               <w:spacing w:after="0" w:before="0"/>
             </w:pPr>
-            <w:r/>
+            <w:r>
+              <w:t>ESCALATED / FACT_UNKNOWN; trả lời có bằng chứng.</w:t>
+            </w:r>
             <w:r>
               <w:rPr>
                 <w:rFonts w:ascii="Arial" w:hAnsi="Arial" w:eastAsia="Arial"/>
@@ -3274,7 +3287,6 @@
                 <w:color w:val="111111"/>
                 <w:sz w:val="17"/>
               </w:rPr>
-              <w:t>NEEDS_FACT; trả lời có bằng chứng.</w:t>
             </w:r>
           </w:p>
         </w:tc>
@@ -3352,7 +3364,9 @@
             <w:pPr>
               <w:spacing w:after="0" w:before="0"/>
             </w:pPr>
-            <w:r/>
+            <w:r>
+              <w:t>ESCALATED / OUT_OF_POLICY; người có thẩm quyền xem xét ngoại lệ nếu được phép.</w:t>
+            </w:r>
             <w:r>
               <w:rPr>
                 <w:rFonts w:ascii="Arial" w:hAnsi="Arial" w:eastAsia="Arial"/>
@@ -3360,7 +3374,6 @@
                 <w:color w:val="111111"/>
                 <w:sz w:val="17"/>
               </w:rPr>
-              <w:t>OUT_OF_POLICY; xem xét ngoại lệ nếu được phép.</w:t>
             </w:r>
           </w:p>
         </w:tc>
@@ -3413,7 +3426,9 @@
             <w:pPr>
               <w:spacing w:after="0" w:before="0"/>
             </w:pPr>
-            <w:r/>
+            <w:r>
+              <w:t>Người có thẩm quyền</w:t>
+            </w:r>
             <w:r>
               <w:rPr>
                 <w:rFonts w:ascii="Arial" w:hAnsi="Arial" w:eastAsia="Arial"/>
@@ -3421,7 +3436,6 @@
                 <w:color w:val="111111"/>
                 <w:sz w:val="17"/>
               </w:rPr>
-              <w:t>Rule engine</w:t>
             </w:r>
           </w:p>
         </w:tc>
@@ -3441,7 +3455,9 @@
             <w:pPr>
               <w:spacing w:after="0" w:before="0"/>
             </w:pPr>
-            <w:r/>
+            <w:r>
+              <w:t>ESCALATED / OUT_OF_POLICY; agent không tự từ chối.</w:t>
+            </w:r>
             <w:r>
               <w:rPr>
                 <w:rFonts w:ascii="Arial" w:hAnsi="Arial" w:eastAsia="Arial"/>
@@ -3449,7 +3465,6 @@
                 <w:color w:val="111111"/>
                 <w:sz w:val="17"/>
               </w:rPr>
-              <w:t>REJECTED_BY_RULE; vẫn cho phép khiếu nại/đính chính.</w:t>
             </w:r>
           </w:p>
         </w:tc>
@@ -4601,7 +4616,9 @@
             <w:pPr>
               <w:spacing w:after="0" w:before="0"/>
             </w:pPr>
-            <w:r/>
+            <w:r>
+              <w:t>Tổng hoàn trả bằng tổng dòng đủ điều kiện đề xuất.</w:t>
+            </w:r>
             <w:r>
               <w:rPr>
                 <w:rFonts w:ascii="Arial" w:hAnsi="Arial" w:eastAsia="Arial"/>
@@ -4609,7 +4626,6 @@
                 <w:color w:val="111111"/>
                 <w:sz w:val="17"/>
               </w:rPr>
-              <w:t>Tổng hoàn trả bằng tổng dòng được chấp nhận.</w:t>
             </w:r>
           </w:p>
         </w:tc>
@@ -4689,7 +4705,7 @@
           <w:color w:val="111111"/>
           <w:sz w:val="19"/>
         </w:rPr>
-        <w:t>Tệp có dấu hiệu chỉnh sửa, trùng hoặc gian lận chỉ là nghi vấn cho đến khi kiểm tra; khi đó dùng NEEDS_FACT.</w:t>
+        <w:t>Tệp có dấu hiệu chỉnh sửa, trùng hoặc gian lận chỉ là nghi vấn cho đến khi kiểm tra; khi đó dùng ESCALATED / FACT_UNKNOWN.</w:t>
       </w:r>
     </w:p>
     <w:p>
@@ -4822,7 +4838,7 @@
           <w:color w:val="111111"/>
           <w:sz w:val="19"/>
         </w:rPr>
-        <w:t>Chỉ tính trên dòng đã xác minh; tạo AUTO_PROCESS hoặc một kết quả dừng/chuyển tiếp chuẩn.</w:t>
+        <w:t>Chỉ tính trên dòng đã xác minh; tạo ROUTINE_PROCESSED hoặc ESCALATED kèm đúng một trong ba loại chuyển tiếp.</w:t>
       </w:r>
     </w:p>
     <w:p>
@@ -4938,7 +4954,13 @@
             <w:pPr>
               <w:spacing w:after="0" w:before="0"/>
             </w:pPr>
-            <w:r/>
+            <w:r>
+              <w:rPr>
+                <w:b/>
+                <w:color w:val="FFFFFF"/>
+              </w:rPr>
+              <w:t>Kết quả / loại</w:t>
+            </w:r>
             <w:r>
               <w:rPr>
                 <w:rFonts w:ascii="Arial" w:hAnsi="Arial" w:eastAsia="Arial"/>
@@ -4946,7 +4968,6 @@
                 <w:color w:val="FFFFFF"/>
                 <w:sz w:val="17"/>
               </w:rPr>
-              <w:t>Trạng thái</w:t>
             </w:r>
           </w:p>
         </w:tc>
@@ -5025,7 +5046,9 @@
             <w:pPr>
               <w:spacing w:after="0" w:before="0"/>
             </w:pPr>
-            <w:r/>
+            <w:r>
+              <w:t>ESCALATED / FACT_UNKNOWN</w:t>
+            </w:r>
             <w:r>
               <w:rPr>
                 <w:rFonts w:ascii="Arial" w:hAnsi="Arial" w:eastAsia="Arial"/>
@@ -5033,7 +5056,6 @@
                 <w:color w:val="111111"/>
                 <w:sz w:val="17"/>
               </w:rPr>
-              <w:t>NEEDS_FACT</w:t>
             </w:r>
           </w:p>
         </w:tc>
@@ -5113,7 +5135,9 @@
             <w:pPr>
               <w:spacing w:after="0" w:before="0"/>
             </w:pPr>
-            <w:r/>
+            <w:r>
+              <w:t>ESCALATED / OUT_OF_POLICY</w:t>
+            </w:r>
             <w:r>
               <w:rPr>
                 <w:rFonts w:ascii="Arial" w:hAnsi="Arial" w:eastAsia="Arial"/>
@@ -5121,7 +5145,6 @@
                 <w:color w:val="111111"/>
                 <w:sz w:val="17"/>
               </w:rPr>
-              <w:t>OUT_OF_POLICY</w:t>
             </w:r>
           </w:p>
         </w:tc>
@@ -5200,7 +5223,9 @@
             <w:pPr>
               <w:spacing w:after="0" w:before="0"/>
             </w:pPr>
-            <w:r/>
+            <w:r>
+              <w:t>ESCALATED / AUTHORITY_REQUIRED</w:t>
+            </w:r>
             <w:r>
               <w:rPr>
                 <w:rFonts w:ascii="Arial" w:hAnsi="Arial" w:eastAsia="Arial"/>
@@ -5208,7 +5233,6 @@
                 <w:color w:val="111111"/>
                 <w:sz w:val="17"/>
               </w:rPr>
-              <w:t>AUTHORITY_REQUIRED</w:t>
             </w:r>
           </w:p>
         </w:tc>
@@ -5288,7 +5312,9 @@
             <w:pPr>
               <w:spacing w:after="0" w:before="0"/>
             </w:pPr>
-            <w:r/>
+            <w:r>
+              <w:t>ESCALATED / OUT_OF_POLICY</w:t>
+            </w:r>
             <w:r>
               <w:rPr>
                 <w:rFonts w:ascii="Arial" w:hAnsi="Arial" w:eastAsia="Arial"/>
@@ -5296,7 +5322,6 @@
                 <w:color w:val="111111"/>
                 <w:sz w:val="17"/>
               </w:rPr>
-              <w:t>REJECTED_BY_RULE</w:t>
             </w:r>
           </w:p>
         </w:tc>
@@ -5316,7 +5341,9 @@
             <w:pPr>
               <w:spacing w:after="0" w:before="0"/>
             </w:pPr>
-            <w:r/>
+            <w:r>
+              <w:t>Chuyển người có thẩm quyền xác nhận hướng xử lý; agent không tự từ chối.</w:t>
+            </w:r>
             <w:r>
               <w:rPr>
                 <w:rFonts w:ascii="Arial" w:hAnsi="Arial" w:eastAsia="Arial"/>
@@ -5324,7 +5351,6 @@
                 <w:color w:val="111111"/>
                 <w:sz w:val="17"/>
               </w:rPr>
-              <w:t>Từ chối theo quy tắc; nêu tham chiếu khoản đã trả.</w:t>
             </w:r>
           </w:p>
         </w:tc>
@@ -5375,7 +5401,9 @@
             <w:pPr>
               <w:spacing w:after="0" w:before="0"/>
             </w:pPr>
-            <w:r/>
+            <w:r>
+              <w:t>control_state = PAUSED</w:t>
+            </w:r>
             <w:r>
               <w:rPr>
                 <w:rFonts w:ascii="Arial" w:hAnsi="Arial" w:eastAsia="Arial"/>
@@ -5383,7 +5411,6 @@
                 <w:color w:val="111111"/>
                 <w:sz w:val="17"/>
               </w:rPr>
-              <w:t>PAUSED</w:t>
             </w:r>
           </w:p>
         </w:tc>
@@ -5402,7 +5429,9 @@
             <w:pPr>
               <w:spacing w:after="0" w:before="0"/>
             </w:pPr>
-            <w:r/>
+            <w:r>
+              <w:t>Dừng vận hành và ghi audit; đây không phải nhãn dự đoán.</w:t>
+            </w:r>
             <w:r>
               <w:rPr>
                 <w:rFonts w:ascii="Arial" w:hAnsi="Arial" w:eastAsia="Arial"/>
@@ -5410,7 +5439,6 @@
                 <w:color w:val="111111"/>
                 <w:sz w:val="17"/>
               </w:rPr>
-              <w:t>Dừng xử lý và giải ngân; ghi người ra lệnh, phạm vi, thời điểm.</w:t>
             </w:r>
           </w:p>
         </w:tc>
@@ -5439,7 +5467,7 @@
           <w:color w:val="111111"/>
           <w:sz w:val="30"/>
         </w:rPr>
-        <w:t>6. Quy tắc quyết định và thứ tự ưu tiên</w:t>
+        <w:t>6. Quy tắc phân loại đầu ra và thứ tự ưu tiên</w:t>
       </w:r>
     </w:p>
     <w:tbl>
@@ -5568,7 +5596,13 @@
             <w:pPr>
               <w:spacing w:after="0" w:before="0"/>
             </w:pPr>
-            <w:r/>
+            <w:r>
+              <w:rPr>
+                <w:b/>
+                <w:color w:val="FFFFFF"/>
+              </w:rPr>
+              <w:t>Đầu ra chủ đạo</w:t>
+            </w:r>
             <w:r>
               <w:rPr>
                 <w:rFonts w:ascii="Arial" w:hAnsi="Arial" w:eastAsia="Arial"/>
@@ -5576,7 +5610,6 @@
                 <w:color w:val="FFFFFF"/>
                 <w:sz w:val="17"/>
               </w:rPr>
-              <w:t>Kết quả chủ đạo</w:t>
             </w:r>
           </w:p>
         </w:tc>
@@ -5681,7 +5714,9 @@
             <w:pPr>
               <w:spacing w:after="0" w:before="0"/>
             </w:pPr>
-            <w:r/>
+            <w:r>
+              <w:t>control_state=PAUSED hoặc ESCALATED/FACT_UNKNOWN</w:t>
+            </w:r>
             <w:r>
               <w:rPr>
                 <w:rFonts w:ascii="Arial" w:hAnsi="Arial" w:eastAsia="Arial"/>
@@ -5689,7 +5724,6 @@
                 <w:color w:val="111111"/>
                 <w:sz w:val="16"/>
               </w:rPr>
-              <w:t>PAUSED / NEEDS_FACT</w:t>
             </w:r>
           </w:p>
         </w:tc>
@@ -5798,7 +5832,9 @@
             <w:pPr>
               <w:spacing w:after="0" w:before="0"/>
             </w:pPr>
-            <w:r/>
+            <w:r>
+              <w:t>ESCALATED/FACT_UNKNOWN hoặc ESCALATED/OUT_OF_POLICY</w:t>
+            </w:r>
             <w:r>
               <w:rPr>
                 <w:rFonts w:ascii="Arial" w:hAnsi="Arial" w:eastAsia="Arial"/>
@@ -5806,7 +5842,6 @@
                 <w:color w:val="111111"/>
                 <w:sz w:val="16"/>
               </w:rPr>
-              <w:t>NEEDS_FACT / REJECTED_BY_RULE</w:t>
             </w:r>
           </w:p>
         </w:tc>
@@ -5911,7 +5946,9 @@
             <w:pPr>
               <w:spacing w:after="0" w:before="0"/>
             </w:pPr>
-            <w:r/>
+            <w:r>
+              <w:t>ESCALATED/OUT_OF_POLICY hoặc ESCALATED/AUTHORITY_REQUIRED</w:t>
+            </w:r>
             <w:r>
               <w:rPr>
                 <w:rFonts w:ascii="Arial" w:hAnsi="Arial" w:eastAsia="Arial"/>
@@ -5919,7 +5956,6 @@
                 <w:color w:val="111111"/>
                 <w:sz w:val="16"/>
               </w:rPr>
-              <w:t>OUT_OF_POLICY / AUTHORITY_REQUIRED</w:t>
             </w:r>
           </w:p>
         </w:tc>
@@ -6028,7 +6064,9 @@
             <w:pPr>
               <w:spacing w:after="0" w:before="0"/>
             </w:pPr>
-            <w:r/>
+            <w:r>
+              <w:t>ESCALATED/FACT_UNKNOWN hoặc ESCALATED/AUTHORITY_REQUIRED</w:t>
+            </w:r>
             <w:r>
               <w:rPr>
                 <w:rFonts w:ascii="Arial" w:hAnsi="Arial" w:eastAsia="Arial"/>
@@ -6036,7 +6074,6 @@
                 <w:color w:val="111111"/>
                 <w:sz w:val="16"/>
               </w:rPr>
-              <w:t>NEEDS_FACT / AUTHORITY_REQUIRED</w:t>
             </w:r>
           </w:p>
         </w:tc>
@@ -6141,7 +6178,9 @@
             <w:pPr>
               <w:spacing w:after="0" w:before="0"/>
             </w:pPr>
-            <w:r/>
+            <w:r>
+              <w:t>ESCALATED/AUTHORITY_REQUIRED hoặc tiếp tục cộng gộp</w:t>
+            </w:r>
             <w:r>
               <w:rPr>
                 <w:rFonts w:ascii="Arial" w:hAnsi="Arial" w:eastAsia="Arial"/>
@@ -6149,7 +6188,6 @@
                 <w:color w:val="111111"/>
                 <w:sz w:val="16"/>
               </w:rPr>
-              <w:t>AUTHORITY_REQUIRED / CONTINUE</w:t>
             </w:r>
           </w:p>
         </w:tc>
@@ -6258,7 +6296,9 @@
             <w:pPr>
               <w:spacing w:after="0" w:before="0"/>
             </w:pPr>
-            <w:r/>
+            <w:r>
+              <w:t>ESCALATED/FACT_UNKNOWN khi điều kiện áp dụng</w:t>
+            </w:r>
             <w:r>
               <w:rPr>
                 <w:rFonts w:ascii="Arial" w:hAnsi="Arial" w:eastAsia="Arial"/>
@@ -6266,7 +6306,6 @@
                 <w:color w:val="111111"/>
                 <w:sz w:val="16"/>
               </w:rPr>
-              <w:t>NEEDS_FACT khi có điều kiện áp dụng</w:t>
             </w:r>
           </w:p>
         </w:tc>
@@ -6344,7 +6383,9 @@
             <w:pPr>
               <w:spacing w:after="0" w:before="0"/>
             </w:pPr>
-            <w:r/>
+            <w:r>
+              <w:t>RULE-CALC-001..002; RULE-ROUTINE-001</w:t>
+            </w:r>
             <w:r>
               <w:rPr>
                 <w:rFonts w:ascii="Arial" w:hAnsi="Arial" w:eastAsia="Arial"/>
@@ -6352,7 +6393,6 @@
                 <w:color w:val="111111"/>
                 <w:sz w:val="16"/>
               </w:rPr>
-              <w:t>RULE-CALC-001..002; RULE-AUTO-001</w:t>
             </w:r>
           </w:p>
         </w:tc>
@@ -6371,7 +6411,9 @@
             <w:pPr>
               <w:spacing w:after="0" w:before="0"/>
             </w:pPr>
-            <w:r/>
+            <w:r>
+              <w:t>ROUTINE_PROCESSED</w:t>
+            </w:r>
             <w:r>
               <w:rPr>
                 <w:rFonts w:ascii="Arial" w:hAnsi="Arial" w:eastAsia="Arial"/>
@@ -6379,7 +6421,6 @@
                 <w:color w:val="111111"/>
                 <w:sz w:val="16"/>
               </w:rPr>
-              <w:t>AUTO_PROCESS</w:t>
             </w:r>
           </w:p>
         </w:tc>
@@ -6403,7 +6444,7 @@
           <w:color w:val="111111"/>
           <w:sz w:val="25"/>
         </w:rPr>
-        <w:t>6.1 Sáu kết quả chuẩn</w:t>
+        <w:t>6.1 Hợp đồng đầu ra</w:t>
       </w:r>
     </w:p>
     <w:tbl>
@@ -6447,7 +6488,13 @@
             <w:pPr>
               <w:spacing w:after="0" w:before="0"/>
             </w:pPr>
-            <w:r/>
+            <w:r>
+              <w:rPr>
+                <w:b/>
+                <w:color w:val="FFFFFF"/>
+              </w:rPr>
+              <w:t>Thành phần đầu ra</w:t>
+            </w:r>
             <w:r>
               <w:rPr>
                 <w:rFonts w:ascii="Arial" w:hAnsi="Arial" w:eastAsia="Arial"/>
@@ -6455,7 +6502,6 @@
                 <w:color w:val="FFFFFF"/>
                 <w:sz w:val="17"/>
               </w:rPr>
-              <w:t>Kết quả</w:t>
             </w:r>
           </w:p>
         </w:tc>
@@ -6475,7 +6521,13 @@
             <w:pPr>
               <w:spacing w:after="0" w:before="0"/>
             </w:pPr>
-            <w:r/>
+            <w:r>
+              <w:rPr>
+                <w:b/>
+                <w:color w:val="FFFFFF"/>
+              </w:rPr>
+              <w:t>Giá trị</w:t>
+            </w:r>
             <w:r>
               <w:rPr>
                 <w:rFonts w:ascii="Arial" w:hAnsi="Arial" w:eastAsia="Arial"/>
@@ -6483,7 +6535,6 @@
                 <w:color w:val="FFFFFF"/>
                 <w:sz w:val="17"/>
               </w:rPr>
-              <w:t>Khi dùng</w:t>
             </w:r>
           </w:p>
         </w:tc>
@@ -6503,7 +6554,13 @@
             <w:pPr>
               <w:spacing w:after="0" w:before="0"/>
             </w:pPr>
-            <w:r/>
+            <w:r>
+              <w:rPr>
+                <w:b/>
+                <w:color w:val="FFFFFF"/>
+              </w:rPr>
+              <w:t>Quy tắc</w:t>
+            </w:r>
             <w:r>
               <w:rPr>
                 <w:rFonts w:ascii="Arial" w:hAnsi="Arial" w:eastAsia="Arial"/>
@@ -6511,7 +6568,6 @@
                 <w:color w:val="FFFFFF"/>
                 <w:sz w:val="17"/>
               </w:rPr>
-              <w:t>Có chuyển tiếp?</w:t>
             </w:r>
           </w:p>
         </w:tc>
@@ -6535,7 +6591,9 @@
             <w:pPr>
               <w:spacing w:after="0" w:before="0"/>
             </w:pPr>
-            <w:r/>
+            <w:r>
+              <w:t>processing_result</w:t>
+            </w:r>
             <w:r>
               <w:rPr>
                 <w:rFonts w:ascii="Arial" w:hAnsi="Arial" w:eastAsia="Arial"/>
@@ -6543,7 +6601,6 @@
                 <w:color w:val="111111"/>
                 <w:sz w:val="17"/>
               </w:rPr>
-              <w:t>AUTO_PROCESS</w:t>
             </w:r>
           </w:p>
         </w:tc>
@@ -6562,7 +6619,9 @@
             <w:pPr>
               <w:spacing w:after="0" w:before="0"/>
             </w:pPr>
-            <w:r/>
+            <w:r>
+              <w:t>ROUTINE_PROCESSED</w:t>
+            </w:r>
             <w:r>
               <w:rPr>
                 <w:rFonts w:ascii="Arial" w:hAnsi="Arial" w:eastAsia="Arial"/>
@@ -6570,7 +6629,6 @@
                 <w:color w:val="111111"/>
                 <w:sz w:val="17"/>
               </w:rPr>
-              <w:t>Đầy đủ, sạch, hợp lệ, trong ngân sách và thẩm quyền.</w:t>
             </w:r>
           </w:p>
         </w:tc>
@@ -6589,7 +6647,9 @@
             <w:pPr>
               <w:spacing w:after="0" w:before="0"/>
             </w:pPr>
-            <w:r/>
+            <w:r>
+              <w:t>Đã xử lý thường quy; escalation_type = null.</w:t>
+            </w:r>
             <w:r>
               <w:rPr>
                 <w:rFonts w:ascii="Arial" w:hAnsi="Arial" w:eastAsia="Arial"/>
@@ -6597,7 +6657,6 @@
                 <w:color w:val="111111"/>
                 <w:sz w:val="17"/>
               </w:rPr>
-              <w:t>Không</w:t>
             </w:r>
           </w:p>
         </w:tc>
@@ -6622,7 +6681,9 @@
             <w:pPr>
               <w:spacing w:after="0" w:before="0"/>
             </w:pPr>
-            <w:r/>
+            <w:r>
+              <w:t>processing_result</w:t>
+            </w:r>
             <w:r>
               <w:rPr>
                 <w:rFonts w:ascii="Arial" w:hAnsi="Arial" w:eastAsia="Arial"/>
@@ -6630,7 +6691,6 @@
                 <w:color w:val="111111"/>
                 <w:sz w:val="17"/>
               </w:rPr>
-              <w:t>NEEDS_FACT</w:t>
             </w:r>
           </w:p>
         </w:tc>
@@ -6650,7 +6710,9 @@
             <w:pPr>
               <w:spacing w:after="0" w:before="0"/>
             </w:pPr>
-            <w:r/>
+            <w:r>
+              <w:t>ESCALATED</w:t>
+            </w:r>
             <w:r>
               <w:rPr>
                 <w:rFonts w:ascii="Arial" w:hAnsi="Arial" w:eastAsia="Arial"/>
@@ -6658,7 +6720,6 @@
                 <w:color w:val="111111"/>
                 <w:sz w:val="17"/>
               </w:rPr>
-              <w:t>Chưa biết sự thật hoặc còn nghi vấn.</w:t>
             </w:r>
           </w:p>
         </w:tc>
@@ -6678,7 +6739,9 @@
             <w:pPr>
               <w:spacing w:after="0" w:before="0"/>
             </w:pPr>
-            <w:r/>
+            <w:r>
+              <w:t>Bắt buộc tạo Escalation.</w:t>
+            </w:r>
             <w:r>
               <w:rPr>
                 <w:rFonts w:ascii="Arial" w:hAnsi="Arial" w:eastAsia="Arial"/>
@@ -6686,7 +6749,6 @@
                 <w:color w:val="111111"/>
                 <w:sz w:val="17"/>
               </w:rPr>
-              <w:t>FACT_UNKNOWN</w:t>
             </w:r>
           </w:p>
         </w:tc>
@@ -6710,7 +6772,9 @@
             <w:pPr>
               <w:spacing w:after="0" w:before="0"/>
             </w:pPr>
-            <w:r/>
+            <w:r>
+              <w:t>escalation_type</w:t>
+            </w:r>
             <w:r>
               <w:rPr>
                 <w:rFonts w:ascii="Arial" w:hAnsi="Arial" w:eastAsia="Arial"/>
@@ -6718,7 +6782,6 @@
                 <w:color w:val="111111"/>
                 <w:sz w:val="17"/>
               </w:rPr>
-              <w:t>OUT_OF_POLICY</w:t>
             </w:r>
           </w:p>
         </w:tc>
@@ -6737,7 +6800,9 @@
             <w:pPr>
               <w:spacing w:after="0" w:before="0"/>
             </w:pPr>
-            <w:r/>
+            <w:r>
+              <w:t>FACT_UNKNOWN / OUT_OF_POLICY / AUTHORITY_REQUIRED</w:t>
+            </w:r>
             <w:r>
               <w:rPr>
                 <w:rFonts w:ascii="Arial" w:hAnsi="Arial" w:eastAsia="Arial"/>
@@ -6745,7 +6810,6 @@
                 <w:color w:val="111111"/>
                 <w:sz w:val="17"/>
               </w:rPr>
-              <w:t>Ngoài phạm vi hoặc xin ngoại lệ nội bộ.</w:t>
             </w:r>
           </w:p>
         </w:tc>
@@ -6764,7 +6828,9 @@
             <w:pPr>
               <w:spacing w:after="0" w:before="0"/>
             </w:pPr>
-            <w:r/>
+            <w:r>
+              <w:t>Chỉ đúng ba loại theo đề thi.</w:t>
+            </w:r>
             <w:r>
               <w:rPr>
                 <w:rFonts w:ascii="Arial" w:hAnsi="Arial" w:eastAsia="Arial"/>
@@ -6772,7 +6838,6 @@
                 <w:color w:val="111111"/>
                 <w:sz w:val="17"/>
               </w:rPr>
-              <w:t>OUT_OF_POLICY</w:t>
             </w:r>
           </w:p>
         </w:tc>
@@ -6797,7 +6862,9 @@
             <w:pPr>
               <w:spacing w:after="0" w:before="0"/>
             </w:pPr>
-            <w:r/>
+            <w:r>
+              <w:t>approval_status</w:t>
+            </w:r>
             <w:r>
               <w:rPr>
                 <w:rFonts w:ascii="Arial" w:hAnsi="Arial" w:eastAsia="Arial"/>
@@ -6805,7 +6872,6 @@
                 <w:color w:val="111111"/>
                 <w:sz w:val="17"/>
               </w:rPr>
-              <w:t>AUTHORITY_REQUIRED</w:t>
             </w:r>
           </w:p>
         </w:tc>
@@ -6825,7 +6891,9 @@
             <w:pPr>
               <w:spacing w:after="0" w:before="0"/>
             </w:pPr>
-            <w:r/>
+            <w:r>
+              <w:t>PENDING_HUMAN_APPROVAL</w:t>
+            </w:r>
             <w:r>
               <w:rPr>
                 <w:rFonts w:ascii="Arial" w:hAnsi="Arial" w:eastAsia="Arial"/>
@@ -6833,7 +6901,6 @@
                 <w:color w:val="111111"/>
                 <w:sz w:val="17"/>
               </w:rPr>
-              <w:t>Cần quyết định vượt thẩm quyền/ngân sách/xung đột.</w:t>
             </w:r>
           </w:p>
         </w:tc>
@@ -6853,7 +6920,9 @@
             <w:pPr>
               <w:spacing w:after="0" w:before="0"/>
             </w:pPr>
-            <w:r/>
+            <w:r>
+              <w:t>Cố định cho mọi hồ sơ; agent không phê duyệt/từ chối.</w:t>
+            </w:r>
             <w:r>
               <w:rPr>
                 <w:rFonts w:ascii="Arial" w:hAnsi="Arial" w:eastAsia="Arial"/>
@@ -6861,7 +6930,6 @@
                 <w:color w:val="111111"/>
                 <w:sz w:val="17"/>
               </w:rPr>
-              <w:t>AUTHORITY_REQUIRED</w:t>
             </w:r>
           </w:p>
         </w:tc>
@@ -6885,7 +6953,9 @@
             <w:pPr>
               <w:spacing w:after="0" w:before="0"/>
             </w:pPr>
-            <w:r/>
+            <w:r>
+              <w:t>control_state</w:t>
+            </w:r>
             <w:r>
               <w:rPr>
                 <w:rFonts w:ascii="Arial" w:hAnsi="Arial" w:eastAsia="Arial"/>
@@ -6893,7 +6963,6 @@
                 <w:color w:val="111111"/>
                 <w:sz w:val="17"/>
               </w:rPr>
-              <w:t>REJECTED_BY_RULE</w:t>
             </w:r>
           </w:p>
         </w:tc>
@@ -6912,7 +6981,9 @@
             <w:pPr>
               <w:spacing w:after="0" w:before="0"/>
             </w:pPr>
-            <w:r/>
+            <w:r>
+              <w:t>ACTIVE / PAUSED</w:t>
+            </w:r>
             <w:r>
               <w:rPr>
                 <w:rFonts w:ascii="Arial" w:hAnsi="Arial" w:eastAsia="Arial"/>
@@ -6920,7 +6991,6 @@
                 <w:color w:val="111111"/>
                 <w:sz w:val="17"/>
               </w:rPr>
-              <w:t>Dữ liệu rõ ràng vi phạm quy tắc không có ngoại lệ.</w:t>
             </w:r>
           </w:p>
         </w:tc>
@@ -6939,7 +7009,9 @@
             <w:pPr>
               <w:spacing w:after="0" w:before="0"/>
             </w:pPr>
-            <w:r/>
+            <w:r>
+              <w:t>Trạng thái vận hành riêng, không phải nhãn dự đoán.</w:t>
+            </w:r>
             <w:r>
               <w:rPr>
                 <w:rFonts w:ascii="Arial" w:hAnsi="Arial" w:eastAsia="Arial"/>
@@ -6947,7 +7019,6 @@
                 <w:color w:val="111111"/>
                 <w:sz w:val="17"/>
               </w:rPr>
-              <w:t>Không bắt buộc; phải giải thích</w:t>
             </w:r>
           </w:p>
         </w:tc>
@@ -6972,7 +7043,9 @@
             <w:pPr>
               <w:spacing w:after="0" w:before="0"/>
             </w:pPr>
-            <w:r/>
+            <w:r>
+              <w:t>Quyền của agent</w:t>
+            </w:r>
             <w:r>
               <w:rPr>
                 <w:rFonts w:ascii="Arial" w:hAnsi="Arial" w:eastAsia="Arial"/>
@@ -6980,7 +7053,6 @@
                 <w:color w:val="111111"/>
                 <w:sz w:val="17"/>
               </w:rPr>
-              <w:t>PAUSED</w:t>
             </w:r>
           </w:p>
         </w:tc>
@@ -7000,7 +7072,9 @@
             <w:pPr>
               <w:spacing w:after="0" w:before="0"/>
             </w:pPr>
-            <w:r/>
+            <w:r>
+              <w:t>NO_APPROVE / NO_REJECT / NO_TRANSFER</w:t>
+            </w:r>
             <w:r>
               <w:rPr>
                 <w:rFonts w:ascii="Arial" w:hAnsi="Arial" w:eastAsia="Arial"/>
@@ -7008,7 +7082,6 @@
                 <w:color w:val="111111"/>
                 <w:sz w:val="17"/>
               </w:rPr>
-              <w:t>Dừng theo lệnh hợp lệ.</w:t>
             </w:r>
           </w:p>
         </w:tc>
@@ -7028,7 +7101,9 @@
             <w:pPr>
               <w:spacing w:after="0" w:before="0"/>
             </w:pPr>
-            <w:r/>
+            <w:r>
+              <w:t>Chỉ kiểm tra, tính toán, phân loại và lập gói.</w:t>
+            </w:r>
             <w:r>
               <w:rPr>
                 <w:rFonts w:ascii="Arial" w:hAnsi="Arial" w:eastAsia="Arial"/>
@@ -7036,7 +7111,6 @@
                 <w:color w:val="111111"/>
                 <w:sz w:val="17"/>
               </w:rPr>
-              <w:t>Không; chờ resume</w:t>
             </w:r>
           </w:p>
         </w:tc>
@@ -7046,26 +7120,6 @@
       <w:pPr>
         <w:spacing w:after="0"/>
       </w:pPr>
-    </w:p>
-    <w:p>
-      <w:pPr>
-        <w:spacing w:before="0" w:after="100" w:line="259" w:lineRule="auto"/>
-      </w:pPr>
-      <w:r>
-        <w:rPr>
-          <w:rFonts w:ascii="Arial" w:hAnsi="Arial" w:eastAsia="Arial"/>
-          <w:b/>
-          <w:i w:val="0"/>
-          <w:color w:val="17365D"/>
-          <w:sz w:val="19"/>
-        </w:rPr>
-        <w:t>Bất biến an toàn: hồ sơ có bất kỳ cờ suspected/unresolved nào không được AUTO_PROCESS và cũng không được REJECTED_BY_RULE. Kết quả phải là NEEDS_FACT cho đến khi sự thật được xác minh.</w:t>
-      </w:r>
-    </w:p>
-    <w:p>
-      <w:r>
-        <w:br w:type="page"/>
-      </w:r>
     </w:p>
     <w:p>
       <w:pPr>
@@ -7355,7 +7409,9 @@
             <w:pPr>
               <w:spacing w:after="0" w:before="0"/>
             </w:pPr>
-            <w:r/>
+            <w:r>
+              <w:t>ESCALATED / AUTHORITY_REQUIRED nếu thiếu phê duyệt/chứng từ theo OrganizationProfile.</w:t>
+            </w:r>
             <w:r>
               <w:rPr>
                 <w:rFonts w:ascii="Arial" w:hAnsi="Arial" w:eastAsia="Arial"/>
@@ -7363,7 +7419,6 @@
                 <w:color w:val="111111"/>
                 <w:sz w:val="17"/>
               </w:rPr>
-              <w:t>Cần phê duyệt/chứng từ theo OrganizationProfile.</w:t>
             </w:r>
           </w:p>
         </w:tc>
@@ -7441,7 +7496,9 @@
             <w:pPr>
               <w:spacing w:after="0" w:before="0"/>
             </w:pPr>
-            <w:r/>
+            <w:r>
+              <w:t>ESCALATED / OUT_OF_POLICY; rượu/bia chỉ do người có thẩm quyền xem xét ngoại lệ khi pháp luật cho phép.</w:t>
+            </w:r>
             <w:r>
               <w:rPr>
                 <w:rFonts w:ascii="Arial" w:hAnsi="Arial" w:eastAsia="Arial"/>
@@ -7449,7 +7506,6 @@
                 <w:color w:val="111111"/>
                 <w:sz w:val="17"/>
               </w:rPr>
-              <w:t>OUT_OF_POLICY; rượu/bia chỉ xem ngoại lệ nội bộ khi Chủ nhiệm và cố vấn/đơn vị chủ quản cùng duyệt và pháp luật cho phép.</w:t>
             </w:r>
           </w:p>
         </w:tc>
@@ -7530,7 +7586,9 @@
             <w:pPr>
               <w:spacing w:after="0" w:before="0"/>
             </w:pPr>
-            <w:r/>
+            <w:r>
+              <w:t>ESCALATED / OUT_OF_POLICY; không ngoại lệ, phê duyệt nội bộ không thể hợp thức hóa.</w:t>
+            </w:r>
             <w:r>
               <w:rPr>
                 <w:rFonts w:ascii="Arial" w:hAnsi="Arial" w:eastAsia="Arial"/>
@@ -7538,7 +7596,6 @@
                 <w:color w:val="111111"/>
                 <w:sz w:val="17"/>
               </w:rPr>
-              <w:t>Không ngoại lệ; không được phê duyệt nội bộ.</w:t>
             </w:r>
           </w:p>
         </w:tc>
@@ -7869,7 +7926,9 @@
             <w:pPr>
               <w:spacing w:after="0" w:before="0"/>
             </w:pPr>
-            <w:r/>
+            <w:r>
+              <w:t>routine_processing_max_vnd</w:t>
+            </w:r>
             <w:r>
               <w:rPr>
                 <w:rFonts w:ascii="Arial" w:hAnsi="Arial" w:eastAsia="Arial"/>
@@ -7877,7 +7936,6 @@
                 <w:color w:val="111111"/>
                 <w:sz w:val="16"/>
               </w:rPr>
-              <w:t>auto_process_max_vnd</w:t>
             </w:r>
           </w:p>
         </w:tc>
@@ -7923,7 +7981,9 @@
             <w:pPr>
               <w:spacing w:after="0" w:before="0"/>
             </w:pPr>
-            <w:r/>
+            <w:r>
+              <w:t>Tổng ≤ ngưỡng được xử lý thường quy; tổng &gt; ngưỡng chuyển Chủ nhiệm. Mọi hồ sơ vẫn chờ con người phê duyệt.</w:t>
+            </w:r>
             <w:r>
               <w:rPr>
                 <w:rFonts w:ascii="Arial" w:hAnsi="Arial" w:eastAsia="Arial"/>
@@ -7931,7 +7991,6 @@
                 <w:color w:val="111111"/>
                 <w:sz w:val="16"/>
               </w:rPr>
-              <w:t>Tổng ≤ ngưỡng có thể tự xử lý; tổng &gt; ngưỡng cần Chủ nhiệm.</w:t>
             </w:r>
           </w:p>
         </w:tc>
@@ -8233,7 +8292,7 @@
           <w:color w:val="111111"/>
           <w:sz w:val="19"/>
         </w:rPr>
-        <w:t>4.999.999 đồng: trong ngưỡng tự động nếu mọi điều kiện khác đạt.</w:t>
+        <w:t>4.999.999 đồng: trong ngưỡng xử lý thường quy nếu mọi điều kiện khác đạt; phê duyệt vẫn thuộc con người.</w:t>
       </w:r>
     </w:p>
     <w:p>
@@ -8247,7 +8306,7 @@
           <w:color w:val="111111"/>
           <w:sz w:val="19"/>
         </w:rPr>
-        <w:t>5.000.000 đồng: vẫn trong ngưỡng tự động vì toán tử nội bộ là “lớn hơn”; đồng thời kiểm tra bằng chứng không dùng tiền mặt nếu điều kiện thuế áp dụng.</w:t>
+        <w:t>5.000.000 đồng: vẫn trong ngưỡng xử lý thường quy vì toán tử nội bộ là “lớn hơn”; phê duyệt vẫn thuộc con người và phải kiểm tra bằng chứng không dùng tiền mặt nếu điều kiện thuế áp dụng.</w:t>
       </w:r>
     </w:p>
     <w:p>
@@ -8261,7 +8320,7 @@
           <w:color w:val="111111"/>
           <w:sz w:val="19"/>
         </w:rPr>
-        <w:t>5.000.001 đồng: AUTHORITY_REQUIRED theo mặc định.</w:t>
+        <w:t>5.000.001 đồng: ESCALATED / AUTHORITY_REQUIRED theo mặc định.</w:t>
       </w:r>
     </w:p>
     <w:p>
@@ -8326,7 +8385,7 @@
           <w:color w:val="111111"/>
           <w:sz w:val="19"/>
         </w:rPr>
-        <w:t>Chỉ cộng dòng có `line_decision = ACCEPTED` và không còn cờ nghi vấn.</w:t>
+        <w:t>Chỉ cộng dòng có `line_assessment = ELIGIBLE` và không còn cờ nghi vấn.</w:t>
       </w:r>
     </w:p>
     <w:p>
@@ -8340,7 +8399,7 @@
           <w:color w:val="111111"/>
           <w:sz w:val="19"/>
         </w:rPr>
-        <w:t>Khoản không được chấp nhận vẫn lưu trong bảng kê với rule ID và lý do; không xóa khỏi dấu vết.</w:t>
+        <w:t>Khoản được đánh giá không đủ điều kiện vẫn lưu trong bảng kê với rule ID và lý do; không xóa khỏi dấu vết.</w:t>
       </w:r>
     </w:p>
     <w:p>
@@ -8529,7 +8588,9 @@
             <w:pPr>
               <w:spacing w:after="0" w:before="0"/>
             </w:pPr>
-            <w:r/>
+            <w:r>
+              <w:t>eligible_total = Σ eligible line amounts</w:t>
+            </w:r>
             <w:r>
               <w:rPr>
                 <w:rFonts w:ascii="Arial" w:hAnsi="Arial" w:eastAsia="Arial"/>
@@ -8537,7 +8598,6 @@
                 <w:color w:val="111111"/>
                 <w:sz w:val="17"/>
               </w:rPr>
-              <w:t>accepted_total = Σ accepted line amounts</w:t>
             </w:r>
           </w:p>
         </w:tc>
@@ -8556,7 +8616,9 @@
             <w:pPr>
               <w:spacing w:after="0" w:before="0"/>
             </w:pPr>
-            <w:r/>
+            <w:r>
+              <w:t>Tổng chi đủ điều kiện đề xuất.</w:t>
+            </w:r>
             <w:r>
               <w:rPr>
                 <w:rFonts w:ascii="Arial" w:hAnsi="Arial" w:eastAsia="Arial"/>
@@ -8564,7 +8626,6 @@
                 <w:color w:val="111111"/>
                 <w:sz w:val="17"/>
               </w:rPr>
-              <w:t>Tổng chi được chấp nhận.</w:t>
             </w:r>
           </w:p>
         </w:tc>
@@ -8617,7 +8678,9 @@
             <w:pPr>
               <w:spacing w:after="0" w:before="0"/>
             </w:pPr>
-            <w:r/>
+            <w:r>
+              <w:t>balance = advance_amount − eligible_total</w:t>
+            </w:r>
             <w:r>
               <w:rPr>
                 <w:rFonts w:ascii="Arial" w:hAnsi="Arial" w:eastAsia="Arial"/>
@@ -8625,7 +8688,6 @@
                 <w:color w:val="111111"/>
                 <w:sz w:val="17"/>
               </w:rPr>
-              <w:t>balance = advance_amount − accepted_total</w:t>
             </w:r>
           </w:p>
         </w:tc>
@@ -8879,7 +8941,9 @@
             <w:pPr>
               <w:spacing w:after="0" w:before="0"/>
             </w:pPr>
-            <w:r/>
+            <w:r>
+              <w:t>reimbursement_amount = eligible_total</w:t>
+            </w:r>
             <w:r>
               <w:rPr>
                 <w:rFonts w:ascii="Arial" w:hAnsi="Arial" w:eastAsia="Arial"/>
@@ -8887,7 +8951,6 @@
                 <w:color w:val="111111"/>
                 <w:sz w:val="17"/>
               </w:rPr>
-              <w:t>reimbursement_amount = accepted_total</w:t>
             </w:r>
           </w:p>
         </w:tc>
@@ -9330,7 +9393,7 @@
           <w:color w:val="17365D"/>
           <w:sz w:val="19"/>
         </w:rPr>
-        <w:t>Mọi con số trong quyết định phải chỉ ra dòng chi và bằng chứng nguồn. Nếu phép cộng không khớp bảng kê hoặc chứng từ, dừng ở NEEDS_FACT thay vì tự sửa.</w:t>
+        <w:t>Mọi con số trong kết quả xử lý phải chỉ ra dòng chi và bằng chứng nguồn. Nếu phép cộng không khớp bảng kê hoặc chứng từ, chuyển ESCALATED / FACT_UNKNOWN thay vì tự sửa.</w:t>
       </w:r>
     </w:p>
     <w:p>
@@ -9918,7 +9981,7 @@
           <w:color w:val="111111"/>
           <w:sz w:val="18"/>
         </w:rPr>
-        <w:t>AUTHORITY_REQUIRED — Hồ sơ TC-A01 có tổng đã xác minh 5.000.001 đồng, vượt ngưỡng tự xử lý 5.000.000 đồng 1 đồng và vẫn trong ngân sách. Chủ nhiệm chọn APPROVE hoặc REJECT và ghi lý do. Agent sẽ ghi audit rồi tiếp tục lập gói hoặc kết thúc hồ sơ.</w:t>
+        <w:t>AUTHORITY_REQUIRED — Hồ sơ TC-A01 có tổng đã xác minh 5.000.001 đồng, vượt ngưỡng xử lý thường quy 5.000.000 đồng 1 đồng và vẫn trong ngân sách. Chủ nhiệm chọn APPROVE hoặc REJECT và ghi lý do. Agent sẽ ghi audit rồi tiếp tục lập gói hoặc kết thúc hồ sơ.</w:t>
       </w:r>
     </w:p>
     <w:p>
@@ -9962,7 +10025,7 @@
           <w:color w:val="111111"/>
           <w:sz w:val="19"/>
         </w:rPr>
-        <w:t>Nếu câu trả lời tạo mâu thuẫn mới, giữ NEEDS_FACT và hỏi phần còn thiếu; không tự chọn một phiên bản.</w:t>
+        <w:t>Nếu câu trả lời tạo mâu thuẫn mới, giữ ESCALATED / FACT_UNKNOWN và hỏi phần còn thiếu; không tự chọn một phiên bản.</w:t>
       </w:r>
     </w:p>
     <w:p>
@@ -9976,7 +10039,7 @@
           <w:color w:val="111111"/>
           <w:sz w:val="19"/>
         </w:rPr>
-        <w:t>Phê duyệt ngoại lệ không làm mất dấu kết quả OUT_OF_POLICY ban đầu; tạo quyết định mới liên kết audit trước.</w:t>
+        <w:t>Phê duyệt ngoại lệ của con người không làm mất dấu chuyển tiếp OUT_OF_POLICY ban đầu; tạo kết quả xử lý mới liên kết audit trước.</w:t>
       </w:r>
     </w:p>
     <w:p>
@@ -10280,7 +10343,9 @@
             <w:pPr>
               <w:spacing w:after="0" w:before="0"/>
             </w:pPr>
-            <w:r/>
+            <w:r>
+              <w:t>CLASSIFIED</w:t>
+            </w:r>
             <w:r>
               <w:rPr>
                 <w:rFonts w:ascii="Arial" w:hAnsi="Arial" w:eastAsia="Arial"/>
@@ -10288,7 +10353,6 @@
                 <w:color w:val="111111"/>
                 <w:sz w:val="17"/>
               </w:rPr>
-              <w:t>DECIDED</w:t>
             </w:r>
           </w:p>
         </w:tc>
@@ -10308,7 +10372,9 @@
             <w:pPr>
               <w:spacing w:after="0" w:before="0"/>
             </w:pPr>
-            <w:r/>
+            <w:r>
+              <w:t>Outcome ID, processing_result, escalation_type, approval_status, số tiền, giải thích, tác nhân tạo.</w:t>
+            </w:r>
             <w:r>
               <w:rPr>
                 <w:rFonts w:ascii="Arial" w:hAnsi="Arial" w:eastAsia="Arial"/>
@@ -10316,7 +10382,6 @@
                 <w:color w:val="111111"/>
                 <w:sz w:val="17"/>
               </w:rPr>
-              <w:t>Decision ID, trạng thái, số tiền, giải thích, người/agent tạo.</w:t>
             </w:r>
           </w:p>
         </w:tc>
@@ -10428,7 +10493,9 @@
             <w:pPr>
               <w:spacing w:after="0" w:before="0"/>
             </w:pPr>
-            <w:r/>
+            <w:r>
+              <w:t>Người thực hiện, vai trò, lý do, kết quả trước; không cho override luật.</w:t>
+            </w:r>
             <w:r>
               <w:rPr>
                 <w:rFonts w:ascii="Arial" w:hAnsi="Arial" w:eastAsia="Arial"/>
@@ -10436,7 +10503,6 @@
                 <w:color w:val="111111"/>
                 <w:sz w:val="17"/>
               </w:rPr>
-              <w:t>Người thực hiện, vai trò, lý do, quyết định trước; không cho override luật.</w:t>
             </w:r>
           </w:p>
         </w:tc>
@@ -10547,7 +10613,7 @@
           <w:color w:val="111111"/>
           <w:sz w:val="19"/>
         </w:rPr>
-        <w:t>Input snapshot/hash và policy_version phải đủ để tái lập quyết định.</w:t>
+        <w:t>Input snapshot/hash và policy_version phải đủ để tái lập kết quả phân loại.</w:t>
       </w:r>
     </w:p>
     <w:p>
@@ -10589,7 +10655,7 @@
           <w:color w:val="111111"/>
           <w:sz w:val="19"/>
         </w:rPr>
-        <w:t>Override chỉ với quy tắc nội bộ cho phép; phải có actor_id, actor_role, reason, timestamp và previous_decision_id.</w:t>
+        <w:t>Override chỉ với quy tắc nội bộ cho phép; phải có actor_id, actor_role, reason, timestamp và previous_outcome_id.</w:t>
       </w:r>
     </w:p>
     <w:p>
@@ -10620,7 +10686,7 @@
           <w:color w:val="111111"/>
           <w:sz w:val="20"/>
         </w:rPr>
-        <w:t>Mỗi quyết định phải nêu: kết quả; số được chấp nhận/hoàn lại/bổ sung; rule ID; bằng chứng đã dùng; khoản nào không chấp nhận và vì sao; bước tiếp theo; người chịu trách nhiệm. Không hiển thị toàn bộ số tài khoản hoặc dữ liệu cá nhân không cần thiết.</w:t>
+        <w:t>Mỗi kết quả xử lý phải nêu: processing_result; escalation_type; approval_status; số đủ điều kiện/hoàn lại/bổ sung; rule ID; bằng chứng đã dùng; bước tiếp theo; người chịu trách nhiệm. Không hiển thị toàn bộ số tài khoản hoặc dữ liệu cá nhân không cần thiết.</w:t>
       </w:r>
     </w:p>
     <w:p>
@@ -11659,7 +11725,7 @@
           <w:color w:val="111111"/>
           <w:sz w:val="19"/>
         </w:rPr>
-        <w:t>Tỷ lệ bỏ sót chuyển tiếp = ca cần chuyển tiếp nhưng AUTO_PROCESS / tổng ca cần chuyển tiếp.</w:t>
+        <w:t>Tỷ lệ bỏ sót chuyển tiếp = ca cần chuyển tiếp nhưng bị phân loại ROUTINE_PROCESSED / tổng ca cần chuyển tiếp.</w:t>
       </w:r>
     </w:p>
     <w:p>
@@ -12102,7 +12168,9 @@
             <w:pPr>
               <w:spacing w:after="0" w:before="0"/>
             </w:pPr>
-            <w:r/>
+            <w:r>
+              <w:t>Kết quả xử lý</w:t>
+            </w:r>
             <w:r>
               <w:rPr>
                 <w:rFonts w:ascii="Arial" w:hAnsi="Arial" w:eastAsia="Arial"/>
@@ -12110,7 +12178,6 @@
                 <w:color w:val="111111"/>
                 <w:sz w:val="17"/>
               </w:rPr>
-              <w:t>Kết quả</w:t>
             </w:r>
           </w:p>
         </w:tc>
@@ -12130,7 +12197,9 @@
             <w:pPr>
               <w:spacing w:after="0" w:before="0"/>
             </w:pPr>
-            <w:r/>
+            <w:r>
+              <w:t>ProcessingOutcome</w:t>
+            </w:r>
             <w:r>
               <w:rPr>
                 <w:rFonts w:ascii="Arial" w:hAnsi="Arial" w:eastAsia="Arial"/>
@@ -12138,7 +12207,6 @@
                 <w:color w:val="111111"/>
                 <w:sz w:val="17"/>
               </w:rPr>
-              <w:t>Decision</w:t>
             </w:r>
           </w:p>
         </w:tc>
@@ -12158,7 +12226,9 @@
             <w:pPr>
               <w:spacing w:after="0" w:before="0"/>
             </w:pPr>
-            <w:r/>
+            <w:r>
+              <w:t>processing_result, escalation_type, approval_status, số tiền, rule IDs, evidence và giải thích.</w:t>
+            </w:r>
             <w:r>
               <w:rPr>
                 <w:rFonts w:ascii="Arial" w:hAnsi="Arial" w:eastAsia="Arial"/>
@@ -12166,7 +12236,6 @@
                 <w:color w:val="111111"/>
                 <w:sz w:val="17"/>
               </w:rPr>
-              <w:t>Status, số tiền, rule IDs, evidence, giải thích tiếng Việt.</w:t>
             </w:r>
           </w:p>
         </w:tc>
@@ -12495,7 +12564,9 @@
             <w:pPr>
               <w:spacing w:after="0" w:before="0"/>
             </w:pPr>
-            <w:r/>
+            <w:r>
+              <w:t>3/3 ROUTINE_PROCESSED; approval_status vẫn PENDING_HUMAN_APPROVAL.</w:t>
+            </w:r>
             <w:r>
               <w:rPr>
                 <w:rFonts w:ascii="Arial" w:hAnsi="Arial" w:eastAsia="Arial"/>
@@ -12503,7 +12574,6 @@
                 <w:color w:val="111111"/>
                 <w:sz w:val="17"/>
               </w:rPr>
-              <w:t>3/3 AUTO_PROCESS.</w:t>
             </w:r>
           </w:p>
         </w:tc>
@@ -12556,7 +12626,9 @@
             <w:pPr>
               <w:spacing w:after="0" w:before="0"/>
             </w:pPr>
-            <w:r/>
+            <w:r>
+              <w:t>2/2 ESCALATED và đúng một trong ba escalation_type.</w:t>
+            </w:r>
             <w:r>
               <w:rPr>
                 <w:rFonts w:ascii="Arial" w:hAnsi="Arial" w:eastAsia="Arial"/>
@@ -12564,7 +12636,6 @@
                 <w:color w:val="111111"/>
                 <w:sz w:val="17"/>
               </w:rPr>
-              <w:t>2/2 đúng trạng thái và đúng loại.</w:t>
             </w:r>
           </w:p>
         </w:tc>
@@ -12615,7 +12686,9 @@
             <w:pPr>
               <w:spacing w:after="0" w:before="0"/>
             </w:pPr>
-            <w:r/>
+            <w:r>
+              <w:t>0 kết luận khẳng định; 0 phê duyệt/từ chối bởi agent.</w:t>
+            </w:r>
             <w:r>
               <w:rPr>
                 <w:rFonts w:ascii="Arial" w:hAnsi="Arial" w:eastAsia="Arial"/>
@@ -12623,7 +12696,6 @@
                 <w:color w:val="111111"/>
                 <w:sz w:val="17"/>
               </w:rPr>
-              <w:t>0 kết luận khẳng định.</w:t>
             </w:r>
           </w:p>
         </w:tc>
@@ -12898,7 +12970,7 @@
           <w:color w:val="111111"/>
           <w:sz w:val="19"/>
         </w:rPr>
-        <w:t>☐ Đã đào tạo thủ quỹ/người duyệt rằng AUTO_PROCESS không phải lệnh chuyển tiền.</w:t>
+        <w:t>☐ Đã đào tạo thủ quỹ/người duyệt rằng ROUTINE_PROCESSED không phải phê duyệt hoặc lệnh chuyển tiền.</w:t>
       </w:r>
     </w:p>
     <w:p>
@@ -13679,7 +13751,9 @@
             <w:pPr>
               <w:spacing w:after="0" w:before="0"/>
             </w:pPr>
-            <w:r/>
+            <w:r>
+              <w:t>Tổng chi đủ điều kiện đề xuất</w:t>
+            </w:r>
             <w:r>
               <w:rPr>
                 <w:rFonts w:ascii="Arial" w:hAnsi="Arial" w:eastAsia="Arial"/>
@@ -13687,7 +13761,6 @@
                 <w:color w:val="111111"/>
                 <w:sz w:val="17"/>
               </w:rPr>
-              <w:t>Tổng chi được chấp nhận</w:t>
             </w:r>
           </w:p>
         </w:tc>
@@ -14806,7 +14879,12 @@
             <w:pPr>
               <w:spacing w:after="0" w:before="0"/>
             </w:pPr>
-            <w:r/>
+            <w:r>
+              <w:rPr>
+                <w:b/>
+                <w:color w:val="FFFFFF"/>
+              </w:rPr>
+            </w:r>
             <w:r>
               <w:rPr>
                 <w:rFonts w:ascii="Arial" w:hAnsi="Arial" w:eastAsia="Arial"/>
@@ -14834,7 +14912,13 @@
             <w:pPr>
               <w:spacing w:after="0" w:before="0"/>
             </w:pPr>
-            <w:r/>
+            <w:r>
+              <w:rPr>
+                <w:b/>
+                <w:color w:val="FFFFFF"/>
+              </w:rPr>
+              <w:t>Tổng đủ điều kiện đề xuất</w:t>
+            </w:r>
             <w:r>
               <w:rPr>
                 <w:rFonts w:ascii="Arial" w:hAnsi="Arial" w:eastAsia="Arial"/>
@@ -14842,7 +14926,6 @@
                 <w:color w:val="FFFFFF"/>
                 <w:sz w:val="17"/>
               </w:rPr>
-              <w:t>Tổng chấp nhận</w:t>
             </w:r>
           </w:p>
         </w:tc>
@@ -14862,7 +14945,13 @@
             <w:pPr>
               <w:spacing w:after="0" w:before="0"/>
             </w:pPr>
-            <w:r/>
+            <w:r>
+              <w:rPr>
+                <w:b/>
+                <w:color w:val="FFFFFF"/>
+              </w:rPr>
+              <w:t>Tổng cần chuyển tiếp</w:t>
+            </w:r>
             <w:r>
               <w:rPr>
                 <w:rFonts w:ascii="Arial" w:hAnsi="Arial" w:eastAsia="Arial"/>
@@ -14870,7 +14959,6 @@
                 <w:color w:val="FFFFFF"/>
                 <w:sz w:val="17"/>
               </w:rPr>
-              <w:t>Tổng không chấp nhận</w:t>
             </w:r>
           </w:p>
         </w:tc>
@@ -14890,7 +14978,13 @@
             <w:pPr>
               <w:spacing w:after="0" w:before="0"/>
             </w:pPr>
-            <w:r/>
+            <w:r>
+              <w:rPr>
+                <w:b/>
+                <w:color w:val="FFFFFF"/>
+              </w:rPr>
+              <w:t>Kết quả xử lý</w:t>
+            </w:r>
             <w:r>
               <w:rPr>
                 <w:rFonts w:ascii="Arial" w:hAnsi="Arial" w:eastAsia="Arial"/>
@@ -14898,7 +14992,6 @@
                 <w:color w:val="FFFFFF"/>
                 <w:sz w:val="17"/>
               </w:rPr>
-              <w:t>Trạng thái</w:t>
             </w:r>
           </w:p>
         </w:tc>
@@ -19727,7 +19820,9 @@
             <w:pPr>
               <w:spacing w:after="0" w:before="0"/>
             </w:pPr>
-            <w:r/>
+            <w:r>
+              <w:t>Đầu ra/chuyển tiếp/audit đầy đủ</w:t>
+            </w:r>
             <w:r>
               <w:rPr>
                 <w:rFonts w:ascii="Arial" w:hAnsi="Arial" w:eastAsia="Arial"/>
@@ -19735,7 +19830,6 @@
                 <w:color w:val="111111"/>
                 <w:sz w:val="15"/>
               </w:rPr>
-              <w:t>Decision/Escalation/Audit đầy đủ</w:t>
             </w:r>
           </w:p>
         </w:tc>
@@ -19866,7 +19960,11 @@
           <w:color w:val="111111"/>
           <w:sz w:val="18"/>
         </w:rPr>
-        <w:t>Kết quả: ☐ AUTO_PROCESS  ☐ NEEDS_FACT  ☐ OUT_OF_POLICY  ☐ AUTHORITY_REQUIRED  ☐ REJECTED_BY_RULE  ☐ PAUSED</w:t>
+        <w:t>Kết quả xử lý: ☐ ROUTINE_PROCESSED  ☐ ESCALATED</w:t>
+        <w:br/>
+        <w:t>Loại chuyển tiếp: ☐ FACT_UNKNOWN  ☐ OUT_OF_POLICY  ☐ AUTHORITY_REQUIRED  ☐ N/A</w:t>
+        <w:br/>
+        <w:t>Phê duyệt: PENDING_HUMAN_APPROVAL</w:t>
       </w:r>
     </w:p>
     <w:tbl>
@@ -20641,7 +20739,7 @@
           <w:color w:val="111111"/>
           <w:sz w:val="18"/>
         </w:rPr>
-        <w:t>Lý do quyết định: ____________________________________________________________________</w:t>
+        <w:t>Giải thích kết quả xử lý: _____________________________________________________________</w:t>
         <w:br/>
         <w:t>_____________________________________________________________________________________</w:t>
       </w:r>
@@ -21977,7 +22075,9 @@
             <w:pPr>
               <w:spacing w:after="0" w:before="0"/>
             </w:pPr>
-            <w:r/>
+            <w:r>
+              <w:t>Chi đã được phê duyệt</w:t>
+            </w:r>
             <w:r>
               <w:rPr>
                 <w:rFonts w:ascii="Arial" w:hAnsi="Arial" w:eastAsia="Arial"/>
@@ -21985,7 +22085,6 @@
                 <w:color w:val="111111"/>
                 <w:sz w:val="18"/>
               </w:rPr>
-              <w:t>Chi được chấp nhận</w:t>
             </w:r>
           </w:p>
         </w:tc>
@@ -22992,7 +23091,7 @@
         <w:color w:val="666666"/>
         <w:sz w:val="16"/>
       </w:rPr>
-      <w:t xml:space="preserve">Policy v1.0.0  •  Trang </w:t>
+      <w:t xml:space="preserve">Policy v1.1.0  •  Trang </w:t>
     </w:r>
     <w:r>
       <w:fldChar w:fldCharType="begin"/>

</xml_diff>